<commit_message>
Improve reader navigation and proofread Japanese proposals
</commit_message>
<xml_diff>
--- a/documents/pc-jp.docx
+++ b/documents/pc-jp.docx
@@ -632,7 +632,7 @@
           <w:rFonts w:ascii="FOT-Matisse Pro B" w:eastAsia="FOT-Matisse Pro B" w:hAnsi="FOT-Matisse Pro B"/>
           <w:lang w:eastAsia="ja-JP"/>
         </w:rPr>
-        <w:t>物語の大きな転換点となるのが、少女「星野」である。彼女は特定のゲームキャラクターを複製した存在ではなく、Project EVEの残片と、主人公が長年大切にしてきた複数のゲームセーブの記憶から形成された新しい意識である。星野、ロブスター01、DPT、</w:t>
+        <w:t>物語の大きな転換点となるのが、少女「星野」である。彼女は特定のゲームキャラクターを複製した存在ではなく、Project EVEの残片と、主人公が長年大切にしてきた複数のゲームのセーブデータの記憶から形成された新しい意識である。星野、ロブスター01、DPT、</w:t>
       </w:r>
       <w:proofErr w:type="spellStart"/>
       <w:r>
@@ -715,6 +715,7 @@
           </w:tcPr>
           <w:p>
             <w:pPr>
+              <w:keepNext/>
               <w:rPr>
                 <w:rFonts w:ascii="FOT-Matisse Pro B" w:eastAsia="FOT-Matisse Pro B" w:hAnsi="FOT-Matisse Pro B"/>
               </w:rPr>
@@ -744,6 +745,7 @@
           </w:tcPr>
           <w:p>
             <w:pPr>
+              <w:keepNext/>
               <w:rPr>
                 <w:rFonts w:ascii="FOT-Matisse Pro B" w:eastAsia="FOT-Matisse Pro B" w:hAnsi="FOT-Matisse Pro B"/>
               </w:rPr>
@@ -1190,7 +1192,7 @@
                 <w:sz w:val="18"/>
                 <w:lang w:eastAsia="ja-JP"/>
               </w:rPr>
-              <w:t>滄海。プログラマーの社畜であり、現実からPC世界へ入る「外部ユーザー」兼、権限の発生源。</w:t>
+              <w:t>滄海。仕事に追われるプログラマーであり、現実からPC世界へ入る「外部ユーザー」兼、権限の発生源。</w:t>
             </w:r>
           </w:p>
         </w:tc>
@@ -1436,7 +1438,7 @@
           <w:rFonts w:ascii="FOT-Matisse Pro B" w:eastAsia="FOT-Matisse Pro B" w:hAnsi="FOT-Matisse Pro B"/>
           <w:lang w:eastAsia="ja-JP"/>
         </w:rPr>
-        <w:t>プログラマーの社畜・滄海は、まだ正式発売されていない海賊版の美少女ゲームを遊ぶため、不明なサイトからファイルをダウンロードし、個人PCを複合型ランサムウェアに感染させてしまう。通常の駆除ソフトは、感染を完全に除去するにはすべての個人ファイルとセーブデータを削除する必要があると警告する。大切なGALGAMEのセーブデータまで失うことを受け入れられない滄海は、突然表示された意識没入型ウイルス駆除製品Cyber Cleanserを試し、自分の意識をPC内部へ同期させる。</w:t>
+        <w:t>仕事に追われるプログラマー・滄海は、まだ正式発売されていない海賊版の美少女ゲームを遊ぶため、出所不明のサイトからファイルをダウンロードし、個人PCを複合型ランサムウェアに感染させてしまう。通常の駆除ソフトは、感染を完全に除去するにはすべての個人ファイルとセーブデータを削除する必要があると警告する。大切なGALGAMEのセーブデータまで失うことを受け入れられない滄海は、突然表示された意識没入型ウイルス駆除製品Cyber Cleanserを試し、自分の意識をPC内部へ同期させる。</w:t>
       </w:r>
     </w:p>
     <w:p>
@@ -1484,7 +1486,7 @@
           <w:rFonts w:ascii="FOT-Matisse Pro B" w:eastAsia="FOT-Matisse Pro B" w:hAnsi="FOT-Matisse Pro B"/>
           <w:lang w:eastAsia="ja-JP"/>
         </w:rPr>
-        <w:t>のProject EVE実験の残片が、滄海が長年大切にしてきた複数のゲームセーブと記憶から「抽象アンカー」を得て形成した新しい意識である。そのためSave.datは単なるデータではなく、彼女にとって「自分が何者か」を支える証明でもある。</w:t>
+        <w:t>のProject EVE実験の残片が、滄海が長年大切にしてきた複数のゲームのセーブデータと記憶から「抽象アンカー」を得て形成した新しい意識である。そのためSave.datは単なるデータではなく、彼女にとって「自分が何者か」を支える証明でもある。</w:t>
       </w:r>
     </w:p>
     <w:p>
@@ -1650,6 +1652,7 @@
           </w:tcPr>
           <w:p>
             <w:pPr>
+              <w:keepNext/>
               <w:rPr>
                 <w:rFonts w:ascii="FOT-Matisse Pro B" w:eastAsia="FOT-Matisse Pro B" w:hAnsi="FOT-Matisse Pro B"/>
               </w:rPr>
@@ -1681,6 +1684,7 @@
           </w:tcPr>
           <w:p>
             <w:pPr>
+              <w:keepNext/>
               <w:rPr>
                 <w:rFonts w:ascii="FOT-Matisse Pro B" w:eastAsia="FOT-Matisse Pro B" w:hAnsi="FOT-Matisse Pro B"/>
                 <w:lang w:eastAsia="ja-JP"/>
@@ -1712,6 +1716,7 @@
           </w:tcPr>
           <w:p>
             <w:pPr>
+              <w:keepNext/>
               <w:rPr>
                 <w:rFonts w:ascii="FOT-Matisse Pro B" w:eastAsia="FOT-Matisse Pro B" w:hAnsi="FOT-Matisse Pro B"/>
                 <w:lang w:eastAsia="ja-JP"/>
@@ -2088,7 +2093,7 @@
                 <w:sz w:val="17"/>
                 <w:lang w:eastAsia="ja-JP"/>
               </w:rPr>
-              <w:t>星野はEVE残片と主人公の大切なセーブ記憶から共同で形成された意識である。</w:t>
+              <w:t>星野はEVE残片と主人公の大切なセーブデータの記憶が結びついて形成された意識である。</w:t>
             </w:r>
           </w:p>
         </w:tc>
@@ -2553,6 +2558,7 @@
           </w:tcPr>
           <w:p>
             <w:pPr>
+              <w:keepNext/>
               <w:rPr>
                 <w:rFonts w:ascii="FOT-Matisse Pro B" w:eastAsia="FOT-Matisse Pro B" w:hAnsi="FOT-Matisse Pro B"/>
               </w:rPr>
@@ -2584,6 +2590,7 @@
           </w:tcPr>
           <w:p>
             <w:pPr>
+              <w:keepNext/>
               <w:rPr>
                 <w:rFonts w:ascii="FOT-Matisse Pro B" w:eastAsia="FOT-Matisse Pro B" w:hAnsi="FOT-Matisse Pro B"/>
                 <w:lang w:eastAsia="ja-JP"/>
@@ -2659,7 +2666,7 @@
                 <w:sz w:val="17"/>
                 <w:lang w:eastAsia="ja-JP"/>
               </w:rPr>
-              <w:t>プログラマーの社畜であり外部ユーザー。自分のPCへ入った後、権限を付与・露出・変更できる特殊な「鍵」にもなる。</w:t>
+              <w:t>仕事に追われるプログラマーであり外部ユーザー。自分のPCへ入った後、権限を付与・露出・変更できる特殊な「鍵」にもなる。</w:t>
             </w:r>
           </w:p>
         </w:tc>
@@ -3376,6 +3383,7 @@
           </w:tcPr>
           <w:p>
             <w:pPr>
+              <w:keepNext/>
               <w:rPr>
                 <w:rFonts w:ascii="FOT-Matisse Pro B" w:eastAsia="FOT-Matisse Pro B" w:hAnsi="FOT-Matisse Pro B"/>
               </w:rPr>
@@ -3407,6 +3415,7 @@
           </w:tcPr>
           <w:p>
             <w:pPr>
+              <w:keepNext/>
               <w:rPr>
                 <w:rFonts w:ascii="FOT-Matisse Pro B" w:eastAsia="FOT-Matisse Pro B" w:hAnsi="FOT-Matisse Pro B"/>
               </w:rPr>
@@ -3436,6 +3445,7 @@
           </w:tcPr>
           <w:p>
             <w:pPr>
+              <w:keepNext/>
               <w:rPr>
                 <w:rFonts w:ascii="FOT-Matisse Pro B" w:eastAsia="FOT-Matisse Pro B" w:hAnsi="FOT-Matisse Pro B"/>
                 <w:lang w:eastAsia="ja-JP"/>
@@ -4395,7 +4405,7 @@
           <w:rFonts w:ascii="FOT-Matisse Pro B" w:eastAsia="FOT-Matisse Pro B" w:hAnsi="FOT-Matisse Pro B"/>
           <w:lang w:eastAsia="ja-JP"/>
         </w:rPr>
-        <w:t>これにより「権限」は、物語上の伏線であると同時にプレイ資源にもなる。外部ユーザーという身分はシステム制限を突破する助けになる一方で、自分の位置を露出させ、</w:t>
+        <w:t>これにより「権限」は、物語上の伏線であると同時にプレイ資源にもなる。外部ユーザーという身分はシステム制限を突破する助けになる一方で、自分の位置が敵に知られやすくなり、</w:t>
       </w:r>
       <w:proofErr w:type="spellStart"/>
       <w:r>
@@ -5069,7 +5079,7 @@
           <w:rFonts w:ascii="FOT-Matisse Pro B" w:eastAsia="FOT-Matisse Pro B" w:hAnsi="FOT-Matisse Pro B"/>
           <w:lang w:eastAsia="ja-JP"/>
         </w:rPr>
-        <w:t>の監視が最も深く、EVE信号を再捕捉されやすい場所だからである。</w:t>
+        <w:t>の監視が最も厳しく、EVE信号を再捕捉されやすい場所だからである。</w:t>
       </w:r>
     </w:p>
     <w:p>
@@ -5139,7 +5149,7 @@
           <w:rFonts w:ascii="FOT-Matisse Pro B" w:eastAsia="FOT-Matisse Pro B" w:hAnsi="FOT-Matisse Pro B"/>
           <w:lang w:eastAsia="ja-JP"/>
         </w:rPr>
-        <w:t>プログラマーの社畜であり、物語の中で唯一、現実からPC世界へ入る外部ユーザー。単調な日常と散らかった賃貸部屋で暮らし、仕事後に美少女ゲームを遊ぶことが安定した心の慰めになっている。物語開始時、PCへ入る理由は大義ではなく、ただ自分が大切にしてきたセーブデータを失いたくないからである。</w:t>
+        <w:t>仕事に追われるプログラマーであり、物語の中で唯一、現実からPC世界へ入る外部ユーザー。散らかった賃貸の部屋で単調な日常を送り、仕事後に美少女ゲームを遊ぶことが安定した心の慰めになっている。物語開始時、PCへ入る理由は大義ではなく、ただ自分が大切にしてきたセーブデータを失いたくないからである。</w:t>
       </w:r>
     </w:p>
     <w:p>
@@ -5222,7 +5232,7 @@
           <w:rFonts w:ascii="FOT-Matisse Pro B" w:eastAsia="FOT-Matisse Pro B" w:hAnsi="FOT-Matisse Pro B"/>
           <w:lang w:eastAsia="ja-JP"/>
         </w:rPr>
-        <w:t>彼女の核は「ゲームから出てきてプレイヤーに寄り添うヒロイン」ではなく、プレイヤーの記憶を材料として生まれながら、自ら新しい選択を行える意識である。最終戦では自分の意思で滄海への致命攻撃を受け、自己崩壊によって完全な意識剥離を阻止し、主人公に選択能力を残す。</w:t>
+        <w:t>彼女の核は「ゲームから出てきてプレイヤーに寄り添うヒロイン」ではなく、プレイヤーの記憶を材料として生まれながら、自ら新しい選択を行える意識である。最終戦では自分の意思で滄海への致命的な攻撃を受け、自己崩壊によって完全な意識剥離を阻止し、主人公に選択能力を残す。</w:t>
       </w:r>
     </w:p>
     <w:p>
@@ -5460,7 +5470,7 @@
           <w:rFonts w:ascii="FOT-Matisse Pro B" w:eastAsia="FOT-Matisse Pro B" w:hAnsi="FOT-Matisse Pro B"/>
           <w:lang w:eastAsia="ja-JP"/>
         </w:rPr>
-        <w:t>旧修復ノードに残るメンテナンス人格は、主にデータの安定化、保護区の維持、390が長期間稼働してきた痕跡の説明を担う。独立したもう一つの主線ではなく、「隠しノードは一時的な避難所ではなく、誰かが長く守ってきた場所だった」という事実を環境として成立させるための存在である。</w:t>
+        <w:t>旧修復ノードに残るメンテナンス人格は、主にデータの安定化、保護区の維持、390が長期間稼働してきた痕跡の説明を担う。独立した別のメインストーリーではなく、「隠しノードは一時的な避難所ではなく、誰かが長く守ってきた場所だった」という事実を環境として成立させるための存在である。</w:t>
       </w:r>
     </w:p>
     <w:p>
@@ -5711,6 +5721,7 @@
           </w:tcPr>
           <w:p>
             <w:pPr>
+              <w:keepNext/>
               <w:rPr>
                 <w:rFonts w:ascii="FOT-Matisse Pro B" w:eastAsia="FOT-Matisse Pro B" w:hAnsi="FOT-Matisse Pro B"/>
               </w:rPr>
@@ -5742,6 +5753,7 @@
           </w:tcPr>
           <w:p>
             <w:pPr>
+              <w:keepNext/>
               <w:rPr>
                 <w:rFonts w:ascii="FOT-Matisse Pro B" w:eastAsia="FOT-Matisse Pro B" w:hAnsi="FOT-Matisse Pro B"/>
                 <w:lang w:eastAsia="ja-JP"/>
@@ -6219,7 +6231,7 @@
           <w:rFonts w:ascii="FOT-Matisse Pro B" w:eastAsia="FOT-Matisse Pro B" w:hAnsi="FOT-Matisse Pro B"/>
           <w:lang w:eastAsia="ja-JP"/>
         </w:rPr>
-        <w:t>プログラマーの社畜・滄海は散らかった賃貸部屋で暮らしており、仕事後に美少女ゲームを遊ぶことが数少ない安定した慰めとなっている。</w:t>
+        <w:t>仕事に追われるプログラマー・滄海は散らかった賃貸部屋で暮らしており、仕事後に美少女ゲームを遊ぶことが数少ない安定した慰めとなっている。</w:t>
       </w:r>
     </w:p>
     <w:p>
@@ -6236,7 +6248,7 @@
           <w:rFonts w:ascii="FOT-Matisse Pro B" w:eastAsia="FOT-Matisse Pro B" w:hAnsi="FOT-Matisse Pro B"/>
           <w:lang w:eastAsia="ja-JP"/>
         </w:rPr>
-        <w:t>まだ正式発売されていない海賊版ゲームを遊ぶため、不明なサイトからファイルをダウンロードし、PCを複合型ランサムウェアに感染させる。</w:t>
+        <w:t>まだ正式発売されていない海賊版ゲームを遊ぶため、出所不明のサイトからファイルをダウンロードし、PCを複合型ランサムウェアに感染させる。</w:t>
       </w:r>
     </w:p>
     <w:p>
@@ -6384,7 +6396,7 @@
           <w:rFonts w:ascii="FOT-Matisse Pro B" w:eastAsia="FOT-Matisse Pro B" w:hAnsi="FOT-Matisse Pro B"/>
           <w:lang w:eastAsia="ja-JP"/>
         </w:rPr>
-        <w:t>滄海はM.2ストレージへセーブデータを探しに行くことを譲らない。ロブスター01は異常なほど恐れ、外部ユーザーの身分を明かさないこと、そしてストレージ内の「見覚えのあるもの」を信用しないことだけを警告する。</w:t>
+        <w:t>滄海は、セーブデータを探すためにM.2ストレージへ向かうといって譲らない。ロブスター01は異常なほど恐れ、外部ユーザーの身分を明かさないこと、そしてストレージ内の「見覚えのあるもの」を信用しないことだけを警告する。</w:t>
       </w:r>
     </w:p>
     <w:p>
@@ -6865,7 +6877,7 @@
           <w:rFonts w:ascii="FOT-Matisse Pro B" w:eastAsia="FOT-Matisse Pro B" w:hAnsi="FOT-Matisse Pro B"/>
           <w:lang w:eastAsia="ja-JP"/>
         </w:rPr>
-        <w:t>を逆転撃破するが、その直後システムに凍結される。アナウンスが告げる。「実験完了。</w:t>
+        <w:t>を逆転して倒すが、その直後システムに凍結される。アナウンスが告げる。「実験完了。</w:t>
       </w:r>
       <w:proofErr w:type="spellStart"/>
       <w:r>
@@ -7052,6 +7064,7 @@
           </w:tcPr>
           <w:p>
             <w:pPr>
+              <w:keepNext/>
               <w:rPr>
                 <w:rFonts w:ascii="FOT-Matisse Pro B" w:eastAsia="FOT-Matisse Pro B" w:hAnsi="FOT-Matisse Pro B"/>
               </w:rPr>
@@ -7081,6 +7094,7 @@
           </w:tcPr>
           <w:p>
             <w:pPr>
+              <w:keepNext/>
               <w:rPr>
                 <w:rFonts w:ascii="FOT-Matisse Pro B" w:eastAsia="FOT-Matisse Pro B" w:hAnsi="FOT-Matisse Pro B"/>
               </w:rPr>
@@ -7110,6 +7124,7 @@
           </w:tcPr>
           <w:p>
             <w:pPr>
+              <w:keepNext/>
               <w:rPr>
                 <w:rFonts w:ascii="FOT-Matisse Pro B" w:eastAsia="FOT-Matisse Pro B" w:hAnsi="FOT-Matisse Pro B"/>
               </w:rPr>
@@ -7739,6 +7754,7 @@
           </w:tcPr>
           <w:p>
             <w:pPr>
+              <w:keepNext/>
               <w:rPr>
                 <w:rFonts w:ascii="FOT-Matisse Pro B" w:eastAsia="FOT-Matisse Pro B" w:hAnsi="FOT-Matisse Pro B"/>
               </w:rPr>
@@ -7770,6 +7786,7 @@
           </w:tcPr>
           <w:p>
             <w:pPr>
+              <w:keepNext/>
               <w:rPr>
                 <w:rFonts w:ascii="FOT-Matisse Pro B" w:eastAsia="FOT-Matisse Pro B" w:hAnsi="FOT-Matisse Pro B"/>
               </w:rPr>
@@ -8484,7 +8501,7 @@
           <w:rFonts w:ascii="FOT-Matisse Pro B" w:eastAsia="FOT-Matisse Pro B" w:hAnsi="FOT-Matisse Pro B"/>
           <w:lang w:eastAsia="ja-JP"/>
         </w:rPr>
-        <w:t>PCモジュールと現実技術の対応をどの程度正確に保てば、コンピューターに詳しいプレイヤーの面白さと一般プレイヤーの読みやすさを両立できるか。</w:t>
+        <w:t>PCモジュールと現実技術の対応をどの程度正確に保てば、コンピューターに詳しいプレイヤーにとっての面白さと一般のプレイヤーにとっての分かりやすさを両立できるか。</w:t>
       </w:r>
     </w:p>
     <w:p>
@@ -8593,6 +8610,7 @@
           </w:tcPr>
           <w:p>
             <w:pPr>
+              <w:keepNext/>
               <w:rPr>
                 <w:rFonts w:ascii="FOT-Matisse Pro B" w:eastAsia="FOT-Matisse Pro B" w:hAnsi="FOT-Matisse Pro B"/>
               </w:rPr>
@@ -8624,6 +8642,7 @@
           </w:tcPr>
           <w:p>
             <w:pPr>
+              <w:keepNext/>
               <w:rPr>
                 <w:rFonts w:ascii="FOT-Matisse Pro B" w:eastAsia="FOT-Matisse Pro B" w:hAnsi="FOT-Matisse Pro B"/>
               </w:rPr>
@@ -9336,6 +9355,7 @@
           </w:tcPr>
           <w:p>
             <w:pPr>
+              <w:keepNext/>
               <w:rPr>
                 <w:rFonts w:ascii="FOT-Matisse Pro B" w:eastAsia="FOT-Matisse Pro B" w:hAnsi="FOT-Matisse Pro B"/>
               </w:rPr>
@@ -9365,6 +9385,7 @@
           </w:tcPr>
           <w:p>
             <w:pPr>
+              <w:keepNext/>
               <w:rPr>
                 <w:rFonts w:ascii="FOT-Matisse Pro B" w:eastAsia="FOT-Matisse Pro B" w:hAnsi="FOT-Matisse Pro B"/>
               </w:rPr>
@@ -10082,7 +10103,7 @@
                 <w:sz w:val="18"/>
                 <w:lang w:eastAsia="ja-JP"/>
               </w:rPr>
-              <w:t>主人公が現実からシステムへ入ったことで持ち込む特殊な権限源。制限を突破できる一方、位置を露出させる。</w:t>
+              <w:t>主人公が現実からシステムへ入ったことで持ち込む特殊な権限源。制限を突破できる一方、位置が知られるリスクもある。</w:t>
             </w:r>
           </w:p>
         </w:tc>
@@ -10154,6 +10175,7 @@
           </w:tcPr>
           <w:p>
             <w:pPr>
+              <w:keepNext/>
               <w:rPr>
                 <w:rFonts w:ascii="FOT-Matisse Pro B" w:eastAsia="FOT-Matisse Pro B" w:hAnsi="FOT-Matisse Pro B"/>
               </w:rPr>
@@ -10185,6 +10207,7 @@
           </w:tcPr>
           <w:p>
             <w:pPr>
+              <w:keepNext/>
               <w:rPr>
                 <w:rFonts w:ascii="FOT-Matisse Pro B" w:eastAsia="FOT-Matisse Pro B" w:hAnsi="FOT-Matisse Pro B"/>
               </w:rPr>
@@ -10214,6 +10237,7 @@
           </w:tcPr>
           <w:p>
             <w:pPr>
+              <w:keepNext/>
               <w:rPr>
                 <w:rFonts w:ascii="FOT-Matisse Pro B" w:eastAsia="FOT-Matisse Pro B" w:hAnsi="FOT-Matisse Pro B"/>
                 <w:lang w:eastAsia="ja-JP"/>

</xml_diff>